<commit_message>
feat(paper): incorporate multi-seed 100-round K=5 empirical crossover results into manuscript and tables
</commit_message>
<xml_diff>
--- a/paper.docx
+++ b/paper.docx
@@ -7756,6 +7756,322 @@
                 <w:color w:val="1E1E1E"/>
                 <w:sz w:val="17"/>
               </w:rPr>
+              <w:t>rho = 0.05</w:t>
+            </w:r>
+          </w:p>
+        </w:tc>
+        <w:tc>
+          <w:tcPr>
+            <w:tcW w:type="dxa" w:w="2592"/>
+            <w:tcMar>
+              <w:top w:w="80" w:type="dxa"/>
+              <w:bottom w:w="80" w:type="dxa"/>
+              <w:left w:w="120" w:type="dxa"/>
+              <w:right w:w="120" w:type="dxa"/>
+            </w:tcMar>
+            <w:shd w:fill="FFFFFF"/>
+          </w:tcPr>
+          <w:p>
+            <w:pPr>
+              <w:spacing w:before="40" w:after="40"/>
+              <w:jc w:val="left"/>
+            </w:pPr>
+            <w:r>
+              <w:rPr>
+                <w:rFonts w:ascii="Times New Roman" w:hAnsi="Times New Roman"/>
+                <w:color w:val="1E1E1E"/>
+                <w:sz w:val="17"/>
+              </w:rPr>
+              <w:t>Random / FedAvg (B0)</w:t>
+            </w:r>
+          </w:p>
+        </w:tc>
+        <w:tc>
+          <w:tcPr>
+            <w:tcW w:type="dxa" w:w="2016"/>
+            <w:tcMar>
+              <w:top w:w="80" w:type="dxa"/>
+              <w:bottom w:w="80" w:type="dxa"/>
+              <w:left w:w="120" w:type="dxa"/>
+              <w:right w:w="120" w:type="dxa"/>
+            </w:tcMar>
+            <w:shd w:fill="FFFFFF"/>
+          </w:tcPr>
+          <w:p>
+            <w:pPr>
+              <w:spacing w:before="40" w:after="40"/>
+              <w:jc w:val="right"/>
+            </w:pPr>
+            <w:r>
+              <w:rPr>
+                <w:rFonts w:ascii="Times New Roman" w:hAnsi="Times New Roman"/>
+                <w:color w:val="1E1E1E"/>
+                <w:sz w:val="17"/>
+              </w:rPr>
+              <w:t>33.08 [30.9, 34.4]</w:t>
+            </w:r>
+          </w:p>
+        </w:tc>
+        <w:tc>
+          <w:tcPr>
+            <w:tcW w:type="dxa" w:w="2016"/>
+            <w:tcMar>
+              <w:top w:w="80" w:type="dxa"/>
+              <w:bottom w:w="80" w:type="dxa"/>
+              <w:left w:w="120" w:type="dxa"/>
+              <w:right w:w="120" w:type="dxa"/>
+            </w:tcMar>
+            <w:shd w:fill="FFFFFF"/>
+          </w:tcPr>
+          <w:p>
+            <w:pPr>
+              <w:spacing w:before="40" w:after="40"/>
+              <w:jc w:val="right"/>
+            </w:pPr>
+            <w:r>
+              <w:rPr>
+                <w:rFonts w:ascii="Times New Roman" w:hAnsi="Times New Roman"/>
+                <w:color w:val="1E1E1E"/>
+                <w:sz w:val="17"/>
+              </w:rPr>
+              <w:t>24.01 [22.8, 26.3]</w:t>
+            </w:r>
+          </w:p>
+        </w:tc>
+        <w:tc>
+          <w:tcPr>
+            <w:tcW w:type="dxa" w:w="1296"/>
+            <w:tcMar>
+              <w:top w:w="80" w:type="dxa"/>
+              <w:bottom w:w="80" w:type="dxa"/>
+              <w:left w:w="120" w:type="dxa"/>
+              <w:right w:w="120" w:type="dxa"/>
+            </w:tcMar>
+            <w:shd w:fill="FFFFFF"/>
+          </w:tcPr>
+          <w:p>
+            <w:pPr>
+              <w:spacing w:before="40" w:after="40"/>
+              <w:jc w:val="right"/>
+            </w:pPr>
+            <w:r>
+              <w:rPr>
+                <w:rFonts w:ascii="Times New Roman" w:hAnsi="Times New Roman"/>
+                <w:color w:val="1E1E1E"/>
+                <w:sz w:val="17"/>
+              </w:rPr>
+              <w:t>0.2432</w:t>
+            </w:r>
+          </w:p>
+        </w:tc>
+        <w:tc>
+          <w:tcPr>
+            <w:tcW w:type="dxa" w:w="1296"/>
+            <w:tcMar>
+              <w:top w:w="80" w:type="dxa"/>
+              <w:bottom w:w="80" w:type="dxa"/>
+              <w:left w:w="120" w:type="dxa"/>
+              <w:right w:w="120" w:type="dxa"/>
+            </w:tcMar>
+            <w:shd w:fill="FFFFFF"/>
+          </w:tcPr>
+          <w:p>
+            <w:pPr>
+              <w:spacing w:before="40" w:after="40"/>
+              <w:jc w:val="right"/>
+            </w:pPr>
+            <w:r>
+              <w:rPr>
+                <w:rFonts w:ascii="Times New Roman" w:hAnsi="Times New Roman"/>
+                <w:color w:val="1E1E1E"/>
+                <w:sz w:val="17"/>
+              </w:rPr>
+              <w:t>99.3%</w:t>
+            </w:r>
+          </w:p>
+        </w:tc>
+      </w:tr>
+      <w:tr>
+        <w:tc>
+          <w:tcPr>
+            <w:tcW w:type="dxa" w:w="1872"/>
+            <w:tcMar>
+              <w:top w:w="80" w:type="dxa"/>
+              <w:bottom w:w="80" w:type="dxa"/>
+              <w:left w:w="120" w:type="dxa"/>
+              <w:right w:w="120" w:type="dxa"/>
+            </w:tcMar>
+            <w:shd w:fill="F2F5F9"/>
+          </w:tcPr>
+          <w:p>
+            <w:pPr>
+              <w:spacing w:before="40" w:after="40"/>
+              <w:jc w:val="left"/>
+            </w:pPr>
+            <w:r>
+              <w:rPr>
+                <w:rFonts w:ascii="Times New Roman" w:hAnsi="Times New Roman"/>
+                <w:color w:val="1E1E1E"/>
+                <w:sz w:val="17"/>
+              </w:rPr>
+              <w:t>rho = 0.05</w:t>
+            </w:r>
+          </w:p>
+        </w:tc>
+        <w:tc>
+          <w:tcPr>
+            <w:tcW w:type="dxa" w:w="2592"/>
+            <w:tcMar>
+              <w:top w:w="80" w:type="dxa"/>
+              <w:bottom w:w="80" w:type="dxa"/>
+              <w:left w:w="120" w:type="dxa"/>
+              <w:right w:w="120" w:type="dxa"/>
+            </w:tcMar>
+            <w:shd w:fill="F2F5F9"/>
+          </w:tcPr>
+          <w:p>
+            <w:pPr>
+              <w:spacing w:before="40" w:after="40"/>
+              <w:jc w:val="left"/>
+            </w:pPr>
+            <w:r>
+              <w:rPr>
+                <w:rFonts w:ascii="Times New Roman" w:hAnsi="Times New Roman"/>
+                <w:color w:val="1E1E1E"/>
+                <w:sz w:val="17"/>
+              </w:rPr>
+              <w:t>FedQual-CPX (B8)</w:t>
+            </w:r>
+          </w:p>
+        </w:tc>
+        <w:tc>
+          <w:tcPr>
+            <w:tcW w:type="dxa" w:w="2016"/>
+            <w:tcMar>
+              <w:top w:w="80" w:type="dxa"/>
+              <w:bottom w:w="80" w:type="dxa"/>
+              <w:left w:w="120" w:type="dxa"/>
+              <w:right w:w="120" w:type="dxa"/>
+            </w:tcMar>
+            <w:shd w:fill="F2F5F9"/>
+          </w:tcPr>
+          <w:p>
+            <w:pPr>
+              <w:spacing w:before="40" w:after="40"/>
+              <w:jc w:val="right"/>
+            </w:pPr>
+            <w:r>
+              <w:rPr>
+                <w:rFonts w:ascii="Times New Roman" w:hAnsi="Times New Roman"/>
+                <w:color w:val="1E1E1E"/>
+                <w:sz w:val="17"/>
+              </w:rPr>
+              <w:t>27.14 [23.6, 30.1]</w:t>
+            </w:r>
+          </w:p>
+        </w:tc>
+        <w:tc>
+          <w:tcPr>
+            <w:tcW w:type="dxa" w:w="2016"/>
+            <w:tcMar>
+              <w:top w:w="80" w:type="dxa"/>
+              <w:bottom w:w="80" w:type="dxa"/>
+              <w:left w:w="120" w:type="dxa"/>
+              <w:right w:w="120" w:type="dxa"/>
+            </w:tcMar>
+            <w:shd w:fill="F2F5F9"/>
+          </w:tcPr>
+          <w:p>
+            <w:pPr>
+              <w:spacing w:before="40" w:after="40"/>
+              <w:jc w:val="right"/>
+            </w:pPr>
+            <w:r>
+              <w:rPr>
+                <w:rFonts w:ascii="Times New Roman" w:hAnsi="Times New Roman"/>
+                <w:color w:val="1E1E1E"/>
+                <w:sz w:val="17"/>
+              </w:rPr>
+              <w:t>23.32 [21.9, 24.3]</w:t>
+            </w:r>
+          </w:p>
+        </w:tc>
+        <w:tc>
+          <w:tcPr>
+            <w:tcW w:type="dxa" w:w="1296"/>
+            <w:tcMar>
+              <w:top w:w="80" w:type="dxa"/>
+              <w:bottom w:w="80" w:type="dxa"/>
+              <w:left w:w="120" w:type="dxa"/>
+              <w:right w:w="120" w:type="dxa"/>
+            </w:tcMar>
+            <w:shd w:fill="F2F5F9"/>
+          </w:tcPr>
+          <w:p>
+            <w:pPr>
+              <w:spacing w:before="40" w:after="40"/>
+              <w:jc w:val="right"/>
+            </w:pPr>
+            <w:r>
+              <w:rPr>
+                <w:rFonts w:ascii="Times New Roman" w:hAnsi="Times New Roman"/>
+                <w:color w:val="1E1E1E"/>
+                <w:sz w:val="17"/>
+              </w:rPr>
+              <w:t>0.4347</w:t>
+            </w:r>
+          </w:p>
+        </w:tc>
+        <w:tc>
+          <w:tcPr>
+            <w:tcW w:type="dxa" w:w="1296"/>
+            <w:tcMar>
+              <w:top w:w="80" w:type="dxa"/>
+              <w:bottom w:w="80" w:type="dxa"/>
+              <w:left w:w="120" w:type="dxa"/>
+              <w:right w:w="120" w:type="dxa"/>
+            </w:tcMar>
+            <w:shd w:fill="F2F5F9"/>
+          </w:tcPr>
+          <w:p>
+            <w:pPr>
+              <w:spacing w:before="40" w:after="40"/>
+              <w:jc w:val="right"/>
+            </w:pPr>
+            <w:r>
+              <w:rPr>
+                <w:rFonts w:ascii="Times New Roman" w:hAnsi="Times New Roman"/>
+                <w:color w:val="1E1E1E"/>
+                <w:sz w:val="17"/>
+              </w:rPr>
+              <w:t>100.0%</w:t>
+            </w:r>
+          </w:p>
+        </w:tc>
+      </w:tr>
+      <w:tr>
+        <w:tc>
+          <w:tcPr>
+            <w:tcW w:type="dxa" w:w="1872"/>
+            <w:tcMar>
+              <w:top w:w="80" w:type="dxa"/>
+              <w:bottom w:w="80" w:type="dxa"/>
+              <w:left w:w="120" w:type="dxa"/>
+              <w:right w:w="120" w:type="dxa"/>
+            </w:tcMar>
+            <w:shd w:fill="FFFFFF"/>
+          </w:tcPr>
+          <w:p>
+            <w:pPr>
+              <w:spacing w:before="40" w:after="40"/>
+              <w:jc w:val="left"/>
+            </w:pPr>
+            <w:r>
+              <w:rPr>
+                <w:rFonts w:ascii="Times New Roman" w:hAnsi="Times New Roman"/>
+                <w:color w:val="1E1E1E"/>
+                <w:sz w:val="17"/>
+              </w:rPr>
               <w:t>rho = 0.10</w:t>
             </w:r>
           </w:p>
@@ -8075,7 +8391,7 @@
           <w:b w:val="0"/>
           <w:i w:val="0"/>
         </w:rPr>
-        <w:t>Table 6 validates this barrier on full multi-seed 100-round evaluations (N=100, T=100). At rho = 0.10, Random selection achieves higher final accuracy (36.80% vs 33.24%) and higher post-drift recovery (31.16% vs 29.43%) with narrower participation inequality (0.1708 vs 0.4846). The sequential detector accumulates samples too slowly to execute recovery before training ends.</w:t>
+        <w:t>Table 6 validates this barrier on full multi-seed 100-round evaluations (N=100, T=100). At severe partial observability (rho = 0.05), Random selection achieves a 5.94% advantage in final accuracy (33.08% vs 27.14%) because the theoretical detection delay of 220 rounds exceeds the entire 100-round budget. At rho = 0.10, Random selection continues to maintain its lead (36.80% vs 33.24%) and higher post-drift recovery (31.16% vs 29.43%) with narrower participation inequality (0.1708 vs 0.4846). The sequential detector accumulates samples too slowly to execute recovery before training ends.</w:t>
       </w:r>
     </w:p>
     <w:p>

</xml_diff>

<commit_message>
fix(paper): reframe Contribution 4 to predicted threshold and rename fig7 to cross-dataset
</commit_message>
<xml_diff>
--- a/paper.docx
+++ b/paper.docx
@@ -174,11 +174,11 @@
         <w:br/>
         <w:t>1. It proves the Delay Inflation Theorem, showing that detection latency inflates by the inverse participation ratio under partial observability.</w:t>
         <w:br/>
-        <w:t>2. It demonstrates across CIFAR-10 and FEMNIST that uniform random selection outperforms change-aware selection under realistic participation rates.</w:t>
+        <w:t>2. It demonstrates across CIFAR-10 and EMNIST-ByClass that uniform random selection outperforms change-aware selection under realistic participation rates.</w:t>
         <w:br/>
         <w:t>3. It reveals the cross-sectional normalization trap, explaining how round-level median scaling masks correlated drift across concurrent clients.</w:t>
         <w:br/>
-        <w:t>4. It identifies the participation crossover threshold where change-point detection transitions from an inert mechanism to an active performance advantage.</w:t>
+        <w:t>4. It derives the predicted participation threshold rho* approx 0.36 required for sequential detectors to overcome observation latency, empirically verifying the barrier at rho in {0.05, 0.10} and outlining conditions for future above-threshold validation.</w:t>
       </w:r>
     </w:p>
     <w:p>
@@ -4698,7 +4698,7 @@
               <a:graphicData uri="http://schemas.openxmlformats.org/drawingml/2006/picture">
                 <pic:pic>
                   <pic:nvPicPr>
-                    <pic:cNvPr id="0" name="fig7_leaf_benchmarks.png"/>
+                    <pic:cNvPr id="0" name="fig7_cross_dataset_benchmarks.png"/>
                     <pic:cNvPicPr/>
                   </pic:nvPicPr>
                   <pic:blipFill>
@@ -7530,7 +7530,7 @@
           <w:color w:val="14325A"/>
           <w:sz w:val="24"/>
         </w:rPr>
-        <w:t>7. The Participation Crossover Threshold</w:t>
+        <w:t>7. A Predicted Participation Threshold</w:t>
       </w:r>
     </w:p>
     <w:p>
@@ -7544,7 +7544,7 @@
           <w:b w:val="0"/>
           <w:i w:val="0"/>
         </w:rPr>
-        <w:t>The negative performance of change-aware selection raises an important question: at what participation ratio does change detection become beneficial? To answer this question, consider the participation ratio rho = K / N. By Theorem 1, round detection latency scales as T_delay = (1 / rho) * tau_obs. For a sequential detector to guide post-drift recovery, detection must occur before a fraction gamma of the post-drift training horizon elapses.</w:t>
+        <w:t>The consistent deficit of change-aware selection under realistic participation rates raises a fundamental question: at what participation ratio could sequential change detection theoretically become beneficial? To analyze this question, consider the participation ratio rho = K / N. By Theorem 1, the round detection latency scales as T_delay = (1 / rho) * tau_obs. For a sequential detector to guide post-drift recovery, detection must occur before a fraction gamma of the post-drift training horizon elapses.</w:t>
       </w:r>
     </w:p>
     <w:p>
@@ -7558,7 +7558,7 @@
           <w:b w:val="0"/>
           <w:i w:val="0"/>
         </w:rPr>
-        <w:t>For typical hyperparameters (tau_obs = 11, T - tau = 50, gamma = 0.6), the critical participation threshold is rho* = 11 / (0.6 * 50) = 0.36. When rho &lt; 0.36 (rho in {0.05, 0.10}), the server doesn't observe clients frequently enough to catch drift in time to recover. Random selection wins because its unbiased sampling avoids observation delays. Once participation crosses above 0.36 (rho &gt;= 0.50), detection latency drops below twenty rounds, allowing change-point selection to actively overtake random sampling.</w:t>
+        <w:t>For typical experimental parameters (tau_obs = 11, T - tau = 50, gamma = 0.6), the critical participation threshold is rho* = 11 / (0.6 * 50) = 0.36. When rho &lt; rho* (evaluated at rho in {0.05, 0.10}), the coordinator doesn't observe clients frequently enough to catch drift in time to recover. Unbiased random sampling wins because it avoids observation delays entirely. The theoretical formulation predicts that only when participation rates exceed rho* could detection latency drop sufficiently to guide adaptive recovery. We verify this barrier empirically below the threshold and leave above-threshold validation to high-bandwidth settings.</w:t>
       </w:r>
     </w:p>
     <w:tbl>
@@ -8377,7 +8377,7 @@
           <w:i/>
           <w:sz w:val="17"/>
         </w:rPr>
-        <w:t>Table 6: Empirical participation crossover sweep results on CIFAR-10.</w:t>
+        <w:t>Table 6: Empirical verification of the partial observability barrier on CIFAR-10.</w:t>
       </w:r>
     </w:p>
     <w:p>

</xml_diff>